<commit_message>
Update feedback form with the latest UI and more comment space
Same structure as the previous feedback form (instructions, one
screenshot per screen, a comment box, overall-feedback box at the
end), refreshed with:
- Current screenshots reflecting all changes from the last review
  round (no audience section, updated product titles/pricing, 3-year
  default, escalated Estimated Annual, pending-review note on Totals)
- A "what changed since the last form" summary up front
- More blank lines in every comment box (7-9 per screen, 12 for
  overall feedback, up from 4-8)

Co-Authored-By: Claude Sonnet 5 <noreply@anthropic.com>
Claude-Session: https://claude.ai/code/session_01MyzjcWcaYPLNWygDxYahJu
</commit_message>
<xml_diff>
--- a/dist/LTS-Pricing-Calculator-Feedback-Form.docx
+++ b/dist/LTS-Pricing-Calculator-Feedback-Form.docx
@@ -27,12 +27,12 @@
           <w:sz w:val="32"/>
           <w:szCs w:val="32"/>
         </w:rPr>
-        <w:t xml:space="preserve">  Pricing Calculator — Feedback Form</w:t>
-      </w:r>
-    </w:p>
-    <w:p>
-      <w:pPr>
-        <w:spacing w:after="220"/>
+        <w:t xml:space="preserve">  Pricing Calculator — Feedback Form (v2)</w:t>
+      </w:r>
+    </w:p>
+    <w:p>
+      <w:pPr>
+        <w:spacing w:after="120"/>
       </w:pPr>
       <w:r>
         <w:rPr>
@@ -42,7 +42,30 @@
           <w:sz w:val="20"/>
           <w:szCs w:val="20"/>
         </w:rPr>
-        <w:t xml:space="preserve">Please review the screens below and mark up anything you'd like changed.</w:t>
+        <w:t xml:space="preserve">Updated with your last round of changes — please review and mark up anything else you'd like changed.</w:t>
+      </w:r>
+    </w:p>
+    <w:p>
+      <w:pPr>
+        <w:spacing w:after="220"/>
+      </w:pPr>
+      <w:r>
+        <w:rPr>
+          <w:b/>
+          <w:bCs/>
+          <w:color w:val="101B33"/>
+          <w:sz w:val="19"/>
+          <w:szCs w:val="19"/>
+        </w:rPr>
+        <w:t xml:space="preserve">What changed since the last form: </w:t>
+      </w:r>
+      <w:r>
+        <w:rPr>
+          <w:color w:val="222833"/>
+          <w:sz w:val="19"/>
+          <w:szCs w:val="19"/>
+        </w:rPr>
+        <w:t xml:space="preserve">"I am a" section removed · Get started goes straight to Your Estimate · new lines default to the 3-Year Contract · product titles/wording updated · Estimated Annual now includes the 6.6% escalation from 1 April · "+ Add line" now lets you pick a product · the Totals screen has a pending-review note, since we're still waiting on the details you mentioned sending through.</w:t>
       </w:r>
     </w:p>
     <w:p>
@@ -112,7 +135,7 @@
           <w:sz w:val="20"/>
           <w:szCs w:val="20"/>
         </w:rPr>
-        <w:t xml:space="preserve">Type your written comments in the blue box underneath each screenshot.</w:t>
+        <w:t xml:space="preserve">Type your written comments in the blue box underneath each screenshot — there's more room this time.</w:t>
       </w:r>
     </w:p>
     <w:p>
@@ -229,7 +252,7 @@
           <w:sz w:val="18"/>
           <w:szCs w:val="18"/>
         </w:rPr>
-        <w:t xml:space="preserve">The header (logo, live cost estimate, login) and the pricing calculator hero banner.</w:t>
+        <w:t xml:space="preserve">The header (logo, live cost estimate, login) and the pricing calculator hero banner. "Get started with LTS" now adds the platform and takes you straight to Your Estimate.</w:t>
       </w:r>
     </w:p>
     <w:p>
@@ -240,7 +263,7 @@
       <w:r>
         <w:drawing>
           <wp:inline distT="0" distB="0" distL="0" distR="0">
-            <wp:extent cx="6096000" cy="2667000"/>
+            <wp:extent cx="5905500" cy="2781300"/>
             <wp:effectExtent t="0" r="0" b="0" l="0"/>
             <wp:docPr id="1" name="" descr="" title=""/>
             <wp:cNvGraphicFramePr>
@@ -265,7 +288,7 @@
                   <pic:spPr bwMode="auto">
                     <a:xfrm>
                       <a:off x="0" y="0"/>
-                      <a:ext cx="6096000" cy="2667000"/>
+                      <a:ext cx="5905500" cy="2781300"/>
                     </a:xfrm>
                     <a:prstGeom prst="rect">
                       <a:avLst/>
@@ -322,43 +345,79 @@
           </w:p>
           <w:p>
             <w:pPr>
-              <w:spacing w:after="160"/>
-            </w:pPr>
-            <w:r>
-              <w:rPr>
-                <w:sz w:val="20"/>
-                <w:szCs w:val="20"/>
-              </w:rPr>
-              <w:t xml:space="preserve"> </w:t>
-            </w:r>
-          </w:p>
-          <w:p>
-            <w:pPr>
-              <w:spacing w:after="160"/>
-            </w:pPr>
-            <w:r>
-              <w:rPr>
-                <w:sz w:val="20"/>
-                <w:szCs w:val="20"/>
-              </w:rPr>
-              <w:t xml:space="preserve"> </w:t>
-            </w:r>
-          </w:p>
-          <w:p>
-            <w:pPr>
-              <w:spacing w:after="160"/>
-            </w:pPr>
-            <w:r>
-              <w:rPr>
-                <w:sz w:val="20"/>
-                <w:szCs w:val="20"/>
-              </w:rPr>
-              <w:t xml:space="preserve"> </w:t>
-            </w:r>
-          </w:p>
-          <w:p>
-            <w:pPr>
-              <w:spacing w:after="160"/>
+              <w:spacing w:after="170"/>
+            </w:pPr>
+            <w:r>
+              <w:rPr>
+                <w:sz w:val="20"/>
+                <w:szCs w:val="20"/>
+              </w:rPr>
+              <w:t xml:space="preserve"> </w:t>
+            </w:r>
+          </w:p>
+          <w:p>
+            <w:pPr>
+              <w:spacing w:after="170"/>
+            </w:pPr>
+            <w:r>
+              <w:rPr>
+                <w:sz w:val="20"/>
+                <w:szCs w:val="20"/>
+              </w:rPr>
+              <w:t xml:space="preserve"> </w:t>
+            </w:r>
+          </w:p>
+          <w:p>
+            <w:pPr>
+              <w:spacing w:after="170"/>
+            </w:pPr>
+            <w:r>
+              <w:rPr>
+                <w:sz w:val="20"/>
+                <w:szCs w:val="20"/>
+              </w:rPr>
+              <w:t xml:space="preserve"> </w:t>
+            </w:r>
+          </w:p>
+          <w:p>
+            <w:pPr>
+              <w:spacing w:after="170"/>
+            </w:pPr>
+            <w:r>
+              <w:rPr>
+                <w:sz w:val="20"/>
+                <w:szCs w:val="20"/>
+              </w:rPr>
+              <w:t xml:space="preserve"> </w:t>
+            </w:r>
+          </w:p>
+          <w:p>
+            <w:pPr>
+              <w:spacing w:after="170"/>
+            </w:pPr>
+            <w:r>
+              <w:rPr>
+                <w:sz w:val="20"/>
+                <w:szCs w:val="20"/>
+              </w:rPr>
+              <w:t xml:space="preserve"> </w:t>
+            </w:r>
+          </w:p>
+          <w:p>
+            <w:pPr>
+              <w:spacing w:after="170"/>
+            </w:pPr>
+            <w:r>
+              <w:rPr>
+                <w:sz w:val="20"/>
+                <w:szCs w:val="20"/>
+              </w:rPr>
+              <w:t xml:space="preserve"> </w:t>
+            </w:r>
+          </w:p>
+          <w:p>
+            <w:pPr>
+              <w:spacing w:after="170"/>
             </w:pPr>
             <w:r>
               <w:rPr>
@@ -403,7 +462,7 @@
           <w:sz w:val="18"/>
           <w:szCs w:val="18"/>
         </w:rPr>
-        <w:t xml:space="preserve">Both products currently listed: the core platform, and the new Time Sheet add-on.</w:t>
+        <w:t xml:space="preserve">Both products, with the updated titles and pricing wording.</w:t>
       </w:r>
     </w:p>
     <w:p>
@@ -414,7 +473,7 @@
       <w:r>
         <w:drawing>
           <wp:inline distT="0" distB="0" distL="0" distR="0">
-            <wp:extent cx="6096000" cy="3829050"/>
+            <wp:extent cx="5905500" cy="3705225"/>
             <wp:effectExtent t="0" r="0" b="0" l="0"/>
             <wp:docPr id="1" name="" descr="" title=""/>
             <wp:cNvGraphicFramePr>
@@ -439,7 +498,7 @@
                   <pic:spPr bwMode="auto">
                     <a:xfrm>
                       <a:off x="0" y="0"/>
-                      <a:ext cx="6096000" cy="3829050"/>
+                      <a:ext cx="5905500" cy="3705225"/>
                     </a:xfrm>
                     <a:prstGeom prst="rect">
                       <a:avLst/>
@@ -496,43 +555,79 @@
           </w:p>
           <w:p>
             <w:pPr>
-              <w:spacing w:after="160"/>
-            </w:pPr>
-            <w:r>
-              <w:rPr>
-                <w:sz w:val="20"/>
-                <w:szCs w:val="20"/>
-              </w:rPr>
-              <w:t xml:space="preserve"> </w:t>
-            </w:r>
-          </w:p>
-          <w:p>
-            <w:pPr>
-              <w:spacing w:after="160"/>
-            </w:pPr>
-            <w:r>
-              <w:rPr>
-                <w:sz w:val="20"/>
-                <w:szCs w:val="20"/>
-              </w:rPr>
-              <w:t xml:space="preserve"> </w:t>
-            </w:r>
-          </w:p>
-          <w:p>
-            <w:pPr>
-              <w:spacing w:after="160"/>
-            </w:pPr>
-            <w:r>
-              <w:rPr>
-                <w:sz w:val="20"/>
-                <w:szCs w:val="20"/>
-              </w:rPr>
-              <w:t xml:space="preserve"> </w:t>
-            </w:r>
-          </w:p>
-          <w:p>
-            <w:pPr>
-              <w:spacing w:after="160"/>
+              <w:spacing w:after="170"/>
+            </w:pPr>
+            <w:r>
+              <w:rPr>
+                <w:sz w:val="20"/>
+                <w:szCs w:val="20"/>
+              </w:rPr>
+              <w:t xml:space="preserve"> </w:t>
+            </w:r>
+          </w:p>
+          <w:p>
+            <w:pPr>
+              <w:spacing w:after="170"/>
+            </w:pPr>
+            <w:r>
+              <w:rPr>
+                <w:sz w:val="20"/>
+                <w:szCs w:val="20"/>
+              </w:rPr>
+              <w:t xml:space="preserve"> </w:t>
+            </w:r>
+          </w:p>
+          <w:p>
+            <w:pPr>
+              <w:spacing w:after="170"/>
+            </w:pPr>
+            <w:r>
+              <w:rPr>
+                <w:sz w:val="20"/>
+                <w:szCs w:val="20"/>
+              </w:rPr>
+              <w:t xml:space="preserve"> </w:t>
+            </w:r>
+          </w:p>
+          <w:p>
+            <w:pPr>
+              <w:spacing w:after="170"/>
+            </w:pPr>
+            <w:r>
+              <w:rPr>
+                <w:sz w:val="20"/>
+                <w:szCs w:val="20"/>
+              </w:rPr>
+              <w:t xml:space="preserve"> </w:t>
+            </w:r>
+          </w:p>
+          <w:p>
+            <w:pPr>
+              <w:spacing w:after="170"/>
+            </w:pPr>
+            <w:r>
+              <w:rPr>
+                <w:sz w:val="20"/>
+                <w:szCs w:val="20"/>
+              </w:rPr>
+              <w:t xml:space="preserve"> </w:t>
+            </w:r>
+          </w:p>
+          <w:p>
+            <w:pPr>
+              <w:spacing w:after="170"/>
+            </w:pPr>
+            <w:r>
+              <w:rPr>
+                <w:sz w:val="20"/>
+                <w:szCs w:val="20"/>
+              </w:rPr>
+              <w:t xml:space="preserve"> </w:t>
+            </w:r>
+          </w:p>
+          <w:p>
+            <w:pPr>
+              <w:spacing w:after="170"/>
             </w:pPr>
             <w:r>
               <w:rPr>
@@ -577,7 +672,7 @@
           <w:sz w:val="18"/>
           <w:szCs w:val="18"/>
         </w:rPr>
-        <w:t xml:space="preserve">A platform line (60 trainees, 2-year contract) plus a Time Sheet line, on the Estimate tab.</w:t>
+        <w:t xml:space="preserve">A platform line (60 trainees, now defaulting to the 3-Year Contract) plus a Time Sheet line (3 users, confirmed pricing), on the Estimate tab.</w:t>
       </w:r>
     </w:p>
     <w:p>
@@ -588,7 +683,7 @@
       <w:r>
         <w:drawing>
           <wp:inline distT="0" distB="0" distL="0" distR="0">
-            <wp:extent cx="6096000" cy="2857500"/>
+            <wp:extent cx="5905500" cy="2076450"/>
             <wp:effectExtent t="0" r="0" b="0" l="0"/>
             <wp:docPr id="1" name="" descr="" title=""/>
             <wp:cNvGraphicFramePr>
@@ -613,7 +708,7 @@
                   <pic:spPr bwMode="auto">
                     <a:xfrm>
                       <a:off x="0" y="0"/>
-                      <a:ext cx="6096000" cy="2857500"/>
+                      <a:ext cx="5905500" cy="2076450"/>
                     </a:xfrm>
                     <a:prstGeom prst="rect">
                       <a:avLst/>
@@ -670,43 +765,103 @@
           </w:p>
           <w:p>
             <w:pPr>
-              <w:spacing w:after="160"/>
-            </w:pPr>
-            <w:r>
-              <w:rPr>
-                <w:sz w:val="20"/>
-                <w:szCs w:val="20"/>
-              </w:rPr>
-              <w:t xml:space="preserve"> </w:t>
-            </w:r>
-          </w:p>
-          <w:p>
-            <w:pPr>
-              <w:spacing w:after="160"/>
-            </w:pPr>
-            <w:r>
-              <w:rPr>
-                <w:sz w:val="20"/>
-                <w:szCs w:val="20"/>
-              </w:rPr>
-              <w:t xml:space="preserve"> </w:t>
-            </w:r>
-          </w:p>
-          <w:p>
-            <w:pPr>
-              <w:spacing w:after="160"/>
-            </w:pPr>
-            <w:r>
-              <w:rPr>
-                <w:sz w:val="20"/>
-                <w:szCs w:val="20"/>
-              </w:rPr>
-              <w:t xml:space="preserve"> </w:t>
-            </w:r>
-          </w:p>
-          <w:p>
-            <w:pPr>
-              <w:spacing w:after="160"/>
+              <w:spacing w:after="170"/>
+            </w:pPr>
+            <w:r>
+              <w:rPr>
+                <w:sz w:val="20"/>
+                <w:szCs w:val="20"/>
+              </w:rPr>
+              <w:t xml:space="preserve"> </w:t>
+            </w:r>
+          </w:p>
+          <w:p>
+            <w:pPr>
+              <w:spacing w:after="170"/>
+            </w:pPr>
+            <w:r>
+              <w:rPr>
+                <w:sz w:val="20"/>
+                <w:szCs w:val="20"/>
+              </w:rPr>
+              <w:t xml:space="preserve"> </w:t>
+            </w:r>
+          </w:p>
+          <w:p>
+            <w:pPr>
+              <w:spacing w:after="170"/>
+            </w:pPr>
+            <w:r>
+              <w:rPr>
+                <w:sz w:val="20"/>
+                <w:szCs w:val="20"/>
+              </w:rPr>
+              <w:t xml:space="preserve"> </w:t>
+            </w:r>
+          </w:p>
+          <w:p>
+            <w:pPr>
+              <w:spacing w:after="170"/>
+            </w:pPr>
+            <w:r>
+              <w:rPr>
+                <w:sz w:val="20"/>
+                <w:szCs w:val="20"/>
+              </w:rPr>
+              <w:t xml:space="preserve"> </w:t>
+            </w:r>
+          </w:p>
+          <w:p>
+            <w:pPr>
+              <w:spacing w:after="170"/>
+            </w:pPr>
+            <w:r>
+              <w:rPr>
+                <w:sz w:val="20"/>
+                <w:szCs w:val="20"/>
+              </w:rPr>
+              <w:t xml:space="preserve"> </w:t>
+            </w:r>
+          </w:p>
+          <w:p>
+            <w:pPr>
+              <w:spacing w:after="170"/>
+            </w:pPr>
+            <w:r>
+              <w:rPr>
+                <w:sz w:val="20"/>
+                <w:szCs w:val="20"/>
+              </w:rPr>
+              <w:t xml:space="preserve"> </w:t>
+            </w:r>
+          </w:p>
+          <w:p>
+            <w:pPr>
+              <w:spacing w:after="170"/>
+            </w:pPr>
+            <w:r>
+              <w:rPr>
+                <w:sz w:val="20"/>
+                <w:szCs w:val="20"/>
+              </w:rPr>
+              <w:t xml:space="preserve"> </w:t>
+            </w:r>
+          </w:p>
+          <w:p>
+            <w:pPr>
+              <w:spacing w:after="170"/>
+            </w:pPr>
+            <w:r>
+              <w:rPr>
+                <w:sz w:val="20"/>
+                <w:szCs w:val="20"/>
+              </w:rPr>
+              <w:t xml:space="preserve"> </w:t>
+            </w:r>
+          </w:p>
+          <w:p>
+            <w:pPr>
+              <w:spacing w:after="170"/>
             </w:pPr>
             <w:r>
               <w:rPr>
@@ -751,7 +906,7 @@
           <w:sz w:val="18"/>
           <w:szCs w:val="18"/>
         </w:rPr>
-        <w:t xml:space="preserve">The running total for the estimate, VAT toggle, and the export / save / share buttons.</w:t>
+        <w:t xml:space="preserve">The running total, VAT toggle, Export to Excel — flagged with a pending-review note since we're still waiting on the details you said you'd send through for this screen.</w:t>
       </w:r>
     </w:p>
     <w:p>
@@ -762,7 +917,7 @@
       <w:r>
         <w:drawing>
           <wp:inline distT="0" distB="0" distL="0" distR="0">
-            <wp:extent cx="6096000" cy="2952750"/>
+            <wp:extent cx="5905500" cy="1943100"/>
             <wp:effectExtent t="0" r="0" b="0" l="0"/>
             <wp:docPr id="1" name="" descr="" title=""/>
             <wp:cNvGraphicFramePr>
@@ -787,7 +942,7 @@
                   <pic:spPr bwMode="auto">
                     <a:xfrm>
                       <a:off x="0" y="0"/>
-                      <a:ext cx="6096000" cy="2952750"/>
+                      <a:ext cx="5905500" cy="1943100"/>
                     </a:xfrm>
                     <a:prstGeom prst="rect">
                       <a:avLst/>
@@ -844,43 +999,103 @@
           </w:p>
           <w:p>
             <w:pPr>
-              <w:spacing w:after="160"/>
-            </w:pPr>
-            <w:r>
-              <w:rPr>
-                <w:sz w:val="20"/>
-                <w:szCs w:val="20"/>
-              </w:rPr>
-              <w:t xml:space="preserve"> </w:t>
-            </w:r>
-          </w:p>
-          <w:p>
-            <w:pPr>
-              <w:spacing w:after="160"/>
-            </w:pPr>
-            <w:r>
-              <w:rPr>
-                <w:sz w:val="20"/>
-                <w:szCs w:val="20"/>
-              </w:rPr>
-              <w:t xml:space="preserve"> </w:t>
-            </w:r>
-          </w:p>
-          <w:p>
-            <w:pPr>
-              <w:spacing w:after="160"/>
-            </w:pPr>
-            <w:r>
-              <w:rPr>
-                <w:sz w:val="20"/>
-                <w:szCs w:val="20"/>
-              </w:rPr>
-              <w:t xml:space="preserve"> </w:t>
-            </w:r>
-          </w:p>
-          <w:p>
-            <w:pPr>
-              <w:spacing w:after="160"/>
+              <w:spacing w:after="170"/>
+            </w:pPr>
+            <w:r>
+              <w:rPr>
+                <w:sz w:val="20"/>
+                <w:szCs w:val="20"/>
+              </w:rPr>
+              <w:t xml:space="preserve"> </w:t>
+            </w:r>
+          </w:p>
+          <w:p>
+            <w:pPr>
+              <w:spacing w:after="170"/>
+            </w:pPr>
+            <w:r>
+              <w:rPr>
+                <w:sz w:val="20"/>
+                <w:szCs w:val="20"/>
+              </w:rPr>
+              <w:t xml:space="preserve"> </w:t>
+            </w:r>
+          </w:p>
+          <w:p>
+            <w:pPr>
+              <w:spacing w:after="170"/>
+            </w:pPr>
+            <w:r>
+              <w:rPr>
+                <w:sz w:val="20"/>
+                <w:szCs w:val="20"/>
+              </w:rPr>
+              <w:t xml:space="preserve"> </w:t>
+            </w:r>
+          </w:p>
+          <w:p>
+            <w:pPr>
+              <w:spacing w:after="170"/>
+            </w:pPr>
+            <w:r>
+              <w:rPr>
+                <w:sz w:val="20"/>
+                <w:szCs w:val="20"/>
+              </w:rPr>
+              <w:t xml:space="preserve"> </w:t>
+            </w:r>
+          </w:p>
+          <w:p>
+            <w:pPr>
+              <w:spacing w:after="170"/>
+            </w:pPr>
+            <w:r>
+              <w:rPr>
+                <w:sz w:val="20"/>
+                <w:szCs w:val="20"/>
+              </w:rPr>
+              <w:t xml:space="preserve"> </w:t>
+            </w:r>
+          </w:p>
+          <w:p>
+            <w:pPr>
+              <w:spacing w:after="170"/>
+            </w:pPr>
+            <w:r>
+              <w:rPr>
+                <w:sz w:val="20"/>
+                <w:szCs w:val="20"/>
+              </w:rPr>
+              <w:t xml:space="preserve"> </w:t>
+            </w:r>
+          </w:p>
+          <w:p>
+            <w:pPr>
+              <w:spacing w:after="170"/>
+            </w:pPr>
+            <w:r>
+              <w:rPr>
+                <w:sz w:val="20"/>
+                <w:szCs w:val="20"/>
+              </w:rPr>
+              <w:t xml:space="preserve"> </w:t>
+            </w:r>
+          </w:p>
+          <w:p>
+            <w:pPr>
+              <w:spacing w:after="170"/>
+            </w:pPr>
+            <w:r>
+              <w:rPr>
+                <w:sz w:val="20"/>
+                <w:szCs w:val="20"/>
+              </w:rPr>
+              <w:t xml:space="preserve"> </w:t>
+            </w:r>
+          </w:p>
+          <w:p>
+            <w:pPr>
+              <w:spacing w:after="170"/>
             </w:pPr>
             <w:r>
               <w:rPr>
@@ -936,7 +1151,7 @@
       <w:r>
         <w:drawing>
           <wp:inline distT="0" distB="0" distL="0" distR="0">
-            <wp:extent cx="6096000" cy="2952750"/>
+            <wp:extent cx="5905500" cy="2876550"/>
             <wp:effectExtent t="0" r="0" b="0" l="0"/>
             <wp:docPr id="1" name="" descr="" title=""/>
             <wp:cNvGraphicFramePr>
@@ -961,7 +1176,7 @@
                   <pic:spPr bwMode="auto">
                     <a:xfrm>
                       <a:off x="0" y="0"/>
-                      <a:ext cx="6096000" cy="2952750"/>
+                      <a:ext cx="5905500" cy="2876550"/>
                     </a:xfrm>
                     <a:prstGeom prst="rect">
                       <a:avLst/>
@@ -1018,43 +1233,103 @@
           </w:p>
           <w:p>
             <w:pPr>
-              <w:spacing w:after="160"/>
-            </w:pPr>
-            <w:r>
-              <w:rPr>
-                <w:sz w:val="20"/>
-                <w:szCs w:val="20"/>
-              </w:rPr>
-              <w:t xml:space="preserve"> </w:t>
-            </w:r>
-          </w:p>
-          <w:p>
-            <w:pPr>
-              <w:spacing w:after="160"/>
-            </w:pPr>
-            <w:r>
-              <w:rPr>
-                <w:sz w:val="20"/>
-                <w:szCs w:val="20"/>
-              </w:rPr>
-              <w:t xml:space="preserve"> </w:t>
-            </w:r>
-          </w:p>
-          <w:p>
-            <w:pPr>
-              <w:spacing w:after="160"/>
-            </w:pPr>
-            <w:r>
-              <w:rPr>
-                <w:sz w:val="20"/>
-                <w:szCs w:val="20"/>
-              </w:rPr>
-              <w:t xml:space="preserve"> </w:t>
-            </w:r>
-          </w:p>
-          <w:p>
-            <w:pPr>
-              <w:spacing w:after="160"/>
+              <w:spacing w:after="170"/>
+            </w:pPr>
+            <w:r>
+              <w:rPr>
+                <w:sz w:val="20"/>
+                <w:szCs w:val="20"/>
+              </w:rPr>
+              <w:t xml:space="preserve"> </w:t>
+            </w:r>
+          </w:p>
+          <w:p>
+            <w:pPr>
+              <w:spacing w:after="170"/>
+            </w:pPr>
+            <w:r>
+              <w:rPr>
+                <w:sz w:val="20"/>
+                <w:szCs w:val="20"/>
+              </w:rPr>
+              <w:t xml:space="preserve"> </w:t>
+            </w:r>
+          </w:p>
+          <w:p>
+            <w:pPr>
+              <w:spacing w:after="170"/>
+            </w:pPr>
+            <w:r>
+              <w:rPr>
+                <w:sz w:val="20"/>
+                <w:szCs w:val="20"/>
+              </w:rPr>
+              <w:t xml:space="preserve"> </w:t>
+            </w:r>
+          </w:p>
+          <w:p>
+            <w:pPr>
+              <w:spacing w:after="170"/>
+            </w:pPr>
+            <w:r>
+              <w:rPr>
+                <w:sz w:val="20"/>
+                <w:szCs w:val="20"/>
+              </w:rPr>
+              <w:t xml:space="preserve"> </w:t>
+            </w:r>
+          </w:p>
+          <w:p>
+            <w:pPr>
+              <w:spacing w:after="170"/>
+            </w:pPr>
+            <w:r>
+              <w:rPr>
+                <w:sz w:val="20"/>
+                <w:szCs w:val="20"/>
+              </w:rPr>
+              <w:t xml:space="preserve"> </w:t>
+            </w:r>
+          </w:p>
+          <w:p>
+            <w:pPr>
+              <w:spacing w:after="170"/>
+            </w:pPr>
+            <w:r>
+              <w:rPr>
+                <w:sz w:val="20"/>
+                <w:szCs w:val="20"/>
+              </w:rPr>
+              <w:t xml:space="preserve"> </w:t>
+            </w:r>
+          </w:p>
+          <w:p>
+            <w:pPr>
+              <w:spacing w:after="170"/>
+            </w:pPr>
+            <w:r>
+              <w:rPr>
+                <w:sz w:val="20"/>
+                <w:szCs w:val="20"/>
+              </w:rPr>
+              <w:t xml:space="preserve"> </w:t>
+            </w:r>
+          </w:p>
+          <w:p>
+            <w:pPr>
+              <w:spacing w:after="170"/>
+            </w:pPr>
+            <w:r>
+              <w:rPr>
+                <w:sz w:val="20"/>
+                <w:szCs w:val="20"/>
+              </w:rPr>
+              <w:t xml:space="preserve"> </w:t>
+            </w:r>
+          </w:p>
+          <w:p>
+            <w:pPr>
+              <w:spacing w:after="170"/>
             </w:pPr>
             <w:r>
               <w:rPr>
@@ -1145,91 +1420,139 @@
           </w:p>
           <w:p>
             <w:pPr>
-              <w:spacing w:after="160"/>
-            </w:pPr>
-            <w:r>
-              <w:rPr>
-                <w:sz w:val="20"/>
-                <w:szCs w:val="20"/>
-              </w:rPr>
-              <w:t xml:space="preserve"> </w:t>
-            </w:r>
-          </w:p>
-          <w:p>
-            <w:pPr>
-              <w:spacing w:after="160"/>
-            </w:pPr>
-            <w:r>
-              <w:rPr>
-                <w:sz w:val="20"/>
-                <w:szCs w:val="20"/>
-              </w:rPr>
-              <w:t xml:space="preserve"> </w:t>
-            </w:r>
-          </w:p>
-          <w:p>
-            <w:pPr>
-              <w:spacing w:after="160"/>
-            </w:pPr>
-            <w:r>
-              <w:rPr>
-                <w:sz w:val="20"/>
-                <w:szCs w:val="20"/>
-              </w:rPr>
-              <w:t xml:space="preserve"> </w:t>
-            </w:r>
-          </w:p>
-          <w:p>
-            <w:pPr>
-              <w:spacing w:after="160"/>
-            </w:pPr>
-            <w:r>
-              <w:rPr>
-                <w:sz w:val="20"/>
-                <w:szCs w:val="20"/>
-              </w:rPr>
-              <w:t xml:space="preserve"> </w:t>
-            </w:r>
-          </w:p>
-          <w:p>
-            <w:pPr>
-              <w:spacing w:after="160"/>
-            </w:pPr>
-            <w:r>
-              <w:rPr>
-                <w:sz w:val="20"/>
-                <w:szCs w:val="20"/>
-              </w:rPr>
-              <w:t xml:space="preserve"> </w:t>
-            </w:r>
-          </w:p>
-          <w:p>
-            <w:pPr>
-              <w:spacing w:after="160"/>
-            </w:pPr>
-            <w:r>
-              <w:rPr>
-                <w:sz w:val="20"/>
-                <w:szCs w:val="20"/>
-              </w:rPr>
-              <w:t xml:space="preserve"> </w:t>
-            </w:r>
-          </w:p>
-          <w:p>
-            <w:pPr>
-              <w:spacing w:after="160"/>
-            </w:pPr>
-            <w:r>
-              <w:rPr>
-                <w:sz w:val="20"/>
-                <w:szCs w:val="20"/>
-              </w:rPr>
-              <w:t xml:space="preserve"> </w:t>
-            </w:r>
-          </w:p>
-          <w:p>
-            <w:pPr>
-              <w:spacing w:after="160"/>
+              <w:spacing w:after="170"/>
+            </w:pPr>
+            <w:r>
+              <w:rPr>
+                <w:sz w:val="20"/>
+                <w:szCs w:val="20"/>
+              </w:rPr>
+              <w:t xml:space="preserve"> </w:t>
+            </w:r>
+          </w:p>
+          <w:p>
+            <w:pPr>
+              <w:spacing w:after="170"/>
+            </w:pPr>
+            <w:r>
+              <w:rPr>
+                <w:sz w:val="20"/>
+                <w:szCs w:val="20"/>
+              </w:rPr>
+              <w:t xml:space="preserve"> </w:t>
+            </w:r>
+          </w:p>
+          <w:p>
+            <w:pPr>
+              <w:spacing w:after="170"/>
+            </w:pPr>
+            <w:r>
+              <w:rPr>
+                <w:sz w:val="20"/>
+                <w:szCs w:val="20"/>
+              </w:rPr>
+              <w:t xml:space="preserve"> </w:t>
+            </w:r>
+          </w:p>
+          <w:p>
+            <w:pPr>
+              <w:spacing w:after="170"/>
+            </w:pPr>
+            <w:r>
+              <w:rPr>
+                <w:sz w:val="20"/>
+                <w:szCs w:val="20"/>
+              </w:rPr>
+              <w:t xml:space="preserve"> </w:t>
+            </w:r>
+          </w:p>
+          <w:p>
+            <w:pPr>
+              <w:spacing w:after="170"/>
+            </w:pPr>
+            <w:r>
+              <w:rPr>
+                <w:sz w:val="20"/>
+                <w:szCs w:val="20"/>
+              </w:rPr>
+              <w:t xml:space="preserve"> </w:t>
+            </w:r>
+          </w:p>
+          <w:p>
+            <w:pPr>
+              <w:spacing w:after="170"/>
+            </w:pPr>
+            <w:r>
+              <w:rPr>
+                <w:sz w:val="20"/>
+                <w:szCs w:val="20"/>
+              </w:rPr>
+              <w:t xml:space="preserve"> </w:t>
+            </w:r>
+          </w:p>
+          <w:p>
+            <w:pPr>
+              <w:spacing w:after="170"/>
+            </w:pPr>
+            <w:r>
+              <w:rPr>
+                <w:sz w:val="20"/>
+                <w:szCs w:val="20"/>
+              </w:rPr>
+              <w:t xml:space="preserve"> </w:t>
+            </w:r>
+          </w:p>
+          <w:p>
+            <w:pPr>
+              <w:spacing w:after="170"/>
+            </w:pPr>
+            <w:r>
+              <w:rPr>
+                <w:sz w:val="20"/>
+                <w:szCs w:val="20"/>
+              </w:rPr>
+              <w:t xml:space="preserve"> </w:t>
+            </w:r>
+          </w:p>
+          <w:p>
+            <w:pPr>
+              <w:spacing w:after="170"/>
+            </w:pPr>
+            <w:r>
+              <w:rPr>
+                <w:sz w:val="20"/>
+                <w:szCs w:val="20"/>
+              </w:rPr>
+              <w:t xml:space="preserve"> </w:t>
+            </w:r>
+          </w:p>
+          <w:p>
+            <w:pPr>
+              <w:spacing w:after="170"/>
+            </w:pPr>
+            <w:r>
+              <w:rPr>
+                <w:sz w:val="20"/>
+                <w:szCs w:val="20"/>
+              </w:rPr>
+              <w:t xml:space="preserve"> </w:t>
+            </w:r>
+          </w:p>
+          <w:p>
+            <w:pPr>
+              <w:spacing w:after="170"/>
+            </w:pPr>
+            <w:r>
+              <w:rPr>
+                <w:sz w:val="20"/>
+                <w:szCs w:val="20"/>
+              </w:rPr>
+              <w:t xml:space="preserve"> </w:t>
+            </w:r>
+          </w:p>
+          <w:p>
+            <w:pPr>
+              <w:spacing w:after="170"/>
             </w:pPr>
             <w:r>
               <w:rPr>

</xml_diff>